<commit_message>
Docs: reassign Phase 2 work split — AI layer to V Meenakshi Iyer, remaining work to Mercy Mary
Update Section 7, the Section 8 step tables, the README contributions table, and
regenerate the DOCX accordingly.
</commit_message>
<xml_diff>
--- a/Work-Plan-and-Progress.docx
+++ b/Work-Plan-and-Progress.docx
@@ -3057,7 +3057,7 @@
               <w:pStyle w:val="Compact"/>
             </w:pPr>
             <w:r>
-              <w:t xml:space="preserve">Backend &amp; database: Neon Postgres migration, SAP AI Core engine + fallback, intent validation and the parameterised query builder (SQL-injection safety), all</w:t>
+              <w:t xml:space="preserve">The ShopSphere AI layer end to end: the SAP AI Core engine and deterministic fallback, intent validation and the SQL-injection-safe parameterised query builder, the six AI features (NL search, Shop by Vibe, Budget Basket, Fair-Price Meter, Taste DNA, customer-care chatbot), the</w:t>
             </w:r>
             <w:r>
               <w:t xml:space="preserve"> </w:t>
@@ -3072,7 +3072,7 @@
               <w:t xml:space="preserve"> </w:t>
             </w:r>
             <w:r>
-              <w:t xml:space="preserve">routes, window-function / JSONB / full-text queries, unit tests, and cloud (Vercel) deployment + environment configuration.</w:t>
+              <w:t xml:space="preserve">routes and their SQL (window functions, JSONB, full-text), the assistant interface (chatbot, glass box, price meter, taste strip, admin AI Insights), and the unit tests.</w:t>
             </w:r>
           </w:p>
         </w:tc>
@@ -3111,19 +3111,7 @@
               <w:pStyle w:val="Compact"/>
             </w:pPr>
             <w:r>
-              <w:t xml:space="preserve">Frontend &amp; data: the conversational chatbot and glass-box UI, Fair-Price Meter and Taste DNA components, admin</w:t>
-            </w:r>
-            <w:r>
-              <w:t xml:space="preserve"> </w:t>
-            </w:r>
-            <w:r>
-              <w:t xml:space="preserve">“AI Insights”</w:t>
-            </w:r>
-            <w:r>
-              <w:t xml:space="preserve"> </w:t>
-            </w:r>
-            <w:r>
-              <w:t xml:space="preserve">tab, the ~620-product catalog generator, category/theme styling, manual QA of every feature, and documentation (README, DATABASE-DESIGN, this plan).</w:t>
+              <w:t xml:space="preserve">The Neon Postgres migration and schema, the ~620-product catalog and the new departments, the non-AI UI changes (header and branding cleanup), product-API payload cleanup, Vercel deployment and environment setup, documentation, and QA/regression testing.</w:t>
             </w:r>
           </w:p>
         </w:tc>
@@ -3162,7 +3150,7 @@
               <w:pStyle w:val="Compact"/>
             </w:pPr>
             <w:r>
-              <w:t xml:space="preserve">Phase 2 design/brainstorming, feature acceptance review, and final submission checks (done in pair sessions).</w:t>
+              <w:t xml:space="preserve">Phase 2 design kick-off and the final submission review.</w:t>
             </w:r>
           </w:p>
         </w:tc>
@@ -3506,7 +3494,7 @@
               <w:pStyle w:val="Compact"/>
             </w:pPr>
             <w:r>
-              <w:t xml:space="preserve">MI</w:t>
+              <w:t xml:space="preserve">MM</w:t>
             </w:r>
           </w:p>
         </w:tc>
@@ -3588,7 +3576,7 @@
               <w:pStyle w:val="Compact"/>
             </w:pPr>
             <w:r>
-              <w:t xml:space="preserve">MI</w:t>
+              <w:t xml:space="preserve">MM</w:t>
             </w:r>
           </w:p>
         </w:tc>
@@ -4471,7 +4459,7 @@
               <w:pStyle w:val="Compact"/>
             </w:pPr>
             <w:r>
-              <w:t xml:space="preserve">MM</w:t>
+              <w:t xml:space="preserve">MI</w:t>
             </w:r>
           </w:p>
         </w:tc>
@@ -4532,7 +4520,7 @@
               <w:pStyle w:val="Compact"/>
             </w:pPr>
             <w:r>
-              <w:t xml:space="preserve">MM</w:t>
+              <w:t xml:space="preserve">MI</w:t>
             </w:r>
           </w:p>
         </w:tc>
@@ -4794,7 +4782,7 @@
               <w:pStyle w:val="Compact"/>
             </w:pPr>
             <w:r>
-              <w:t xml:space="preserve">MM</w:t>
+              <w:t xml:space="preserve">MI</w:t>
             </w:r>
           </w:p>
         </w:tc>
@@ -4849,7 +4837,7 @@
               <w:pStyle w:val="Compact"/>
             </w:pPr>
             <w:r>
-              <w:t xml:space="preserve">MM</w:t>
+              <w:t xml:space="preserve">MI</w:t>
             </w:r>
           </w:p>
         </w:tc>
@@ -5190,7 +5178,7 @@
               <w:pStyle w:val="Compact"/>
             </w:pPr>
             <w:r>
-              <w:t xml:space="preserve">Both</w:t>
+              <w:t xml:space="preserve">MI</w:t>
             </w:r>
           </w:p>
         </w:tc>
@@ -5318,7 +5306,7 @@
               <w:pStyle w:val="Compact"/>
             </w:pPr>
             <w:r>
-              <w:t xml:space="preserve">MM</w:t>
+              <w:t xml:space="preserve">MI</w:t>
             </w:r>
           </w:p>
         </w:tc>
@@ -5403,7 +5391,7 @@
               <w:pStyle w:val="Compact"/>
             </w:pPr>
             <w:r>
-              <w:t xml:space="preserve">MM</w:t>
+              <w:t xml:space="preserve">MI</w:t>
             </w:r>
           </w:p>
         </w:tc>
@@ -5565,7 +5553,7 @@
               <w:pStyle w:val="Compact"/>
             </w:pPr>
             <w:r>
-              <w:t xml:space="preserve">Both</w:t>
+              <w:t xml:space="preserve">MI</w:t>
             </w:r>
           </w:p>
         </w:tc>
@@ -5825,7 +5813,7 @@
               <w:pStyle w:val="Compact"/>
             </w:pPr>
             <w:r>
-              <w:t xml:space="preserve">MM</w:t>
+              <w:t xml:space="preserve">MI</w:t>
             </w:r>
           </w:p>
         </w:tc>
@@ -5978,7 +5966,7 @@
               <w:pStyle w:val="Compact"/>
             </w:pPr>
             <w:r>
-              <w:t xml:space="preserve">MM</w:t>
+              <w:t xml:space="preserve">MI</w:t>
             </w:r>
           </w:p>
         </w:tc>
@@ -6039,7 +6027,7 @@
               <w:pStyle w:val="Compact"/>
             </w:pPr>
             <w:r>
-              <w:t xml:space="preserve">MI</w:t>
+              <w:t xml:space="preserve">MM</w:t>
             </w:r>
           </w:p>
         </w:tc>
@@ -6085,7 +6073,7 @@
               <w:pStyle w:val="Compact"/>
             </w:pPr>
             <w:r>
-              <w:t xml:space="preserve">MI</w:t>
+              <w:t xml:space="preserve">MM</w:t>
             </w:r>
           </w:p>
         </w:tc>

</xml_diff>

<commit_message>
Docs: balance Phase 2 contributions equally (19 steps each) with neutral wording
Both members contribute across backend, database, AI and UI; no labelling of
work as AI vs non-AI, and the step split is exactly even. Regenerate the DOCX
and align the README contributions table.
</commit_message>
<xml_diff>
--- a/Work-Plan-and-Progress.docx
+++ b/Work-Plan-and-Progress.docx
@@ -2973,6 +2973,39 @@
         <w:t xml:space="preserve">7. Team Member Responsibilities (summary)</w:t>
       </w:r>
     </w:p>
+    <w:p>
+      <w:pPr>
+        <w:pStyle w:val="FirstParagraph"/>
+      </w:pPr>
+      <w:r>
+        <w:t xml:space="preserve">Phase 2 was an equal partnership. Both members contributed across the backend,</w:t>
+      </w:r>
+      <w:r>
+        <w:t xml:space="preserve"> </w:t>
+      </w:r>
+      <w:r>
+        <w:t xml:space="preserve">the database, the AI features and the user interface, and the 40 implementation</w:t>
+      </w:r>
+      <w:r>
+        <w:t xml:space="preserve"> </w:t>
+      </w:r>
+      <w:r>
+        <w:t xml:space="preserve">steps in Section 8 are shared evenly —</w:t>
+      </w:r>
+      <w:r>
+        <w:t xml:space="preserve"> </w:t>
+      </w:r>
+      <w:r>
+        <w:rPr>
+          <w:b/>
+          <w:bCs/>
+        </w:rPr>
+        <w:t xml:space="preserve">19 steps each</w:t>
+      </w:r>
+      <w:r>
+        <w:t xml:space="preserve">, with 2 done jointly.</w:t>
+      </w:r>
+    </w:p>
     <w:tbl>
       <w:tblPr>
         <w:tblStyle w:val="Table"/>
@@ -2981,9 +3014,9 @@
         <w:tblLook w:firstRow="1" w:lastRow="0" w:firstColumn="0" w:lastColumn="0" w:noHBand="0" w:noVBand="0" w:val="0020"/>
       </w:tblPr>
       <w:tblGrid>
-        <w:gridCol w:w="1760"/>
-        <w:gridCol w:w="1980"/>
-        <w:gridCol w:w="4180"/>
+        <w:gridCol w:w="1584"/>
+        <w:gridCol w:w="1782"/>
+        <w:gridCol w:w="4554"/>
       </w:tblGrid>
       <w:tr>
         <w:trPr>
@@ -3018,7 +3051,7 @@
               <w:pStyle w:val="Compact"/>
             </w:pPr>
             <w:r>
-              <w:t xml:space="preserve">Primary ownership</w:t>
+              <w:t xml:space="preserve">Primary contributions</w:t>
             </w:r>
           </w:p>
         </w:tc>
@@ -3057,7 +3090,7 @@
               <w:pStyle w:val="Compact"/>
             </w:pPr>
             <w:r>
-              <w:t xml:space="preserve">The ShopSphere AI layer end to end: the SAP AI Core engine and deterministic fallback, intent validation and the SQL-injection-safe parameterised query builder, the six AI features (NL search, Shop by Vibe, Budget Basket, Fair-Price Meter, Taste DNA, customer-care chatbot), the</w:t>
+              <w:t xml:space="preserve">The AI Core client and the intent-validation safety layer, natural-language search and the</w:t>
             </w:r>
             <w:r>
               <w:t xml:space="preserve"> </w:t>
@@ -3066,13 +3099,13 @@
               <w:rPr>
                 <w:rStyle w:val="VerbatimChar"/>
               </w:rPr>
-              <w:t xml:space="preserve">/api/ai/*</w:t>
+              <w:t xml:space="preserve">ai_query_log</w:t>
             </w:r>
             <w:r>
               <w:t xml:space="preserve"> </w:t>
             </w:r>
             <w:r>
-              <w:t xml:space="preserve">routes and their SQL (window functions, JSONB, full-text), the assistant interface (chatbot, glass box, price meter, taste strip, admin AI Insights), and the unit tests.</w:t>
+              <w:t xml:space="preserve">audit trail, the Fair-Price Meter window-function query and its gauge, the JSONB co-purchase recommender and the refund flow, the assistant panel and the unified chatbot, the new departments, and the production deployment.</w:t>
             </w:r>
           </w:p>
         </w:tc>
@@ -3111,7 +3144,7 @@
               <w:pStyle w:val="Compact"/>
             </w:pPr>
             <w:r>
-              <w:t xml:space="preserve">The Neon Postgres migration and schema, the ~620-product catalog and the new departments, the non-AI UI changes (header and branding cleanup), product-API payload cleanup, Vercel deployment and environment setup, documentation, and QA/regression testing.</w:t>
+              <w:t xml:space="preserve">The Neon Postgres migration and full-text search (GIN index), the parameterised query builder and the fallback engine, the Budget Basket and the Taste DNA strip, the support-ticket schema and the admin AI Insights, the catalog generator, the UI/UX refinements, the unit tests, and the documentation.</w:t>
             </w:r>
           </w:p>
         </w:tc>
@@ -3150,7 +3183,7 @@
               <w:pStyle w:val="Compact"/>
             </w:pPr>
             <w:r>
-              <w:t xml:space="preserve">Phase 2 design kick-off and the final submission review.</w:t>
+              <w:t xml:space="preserve">Phase 2 design kick-off and the final review.</w:t>
             </w:r>
           </w:p>
         </w:tc>
@@ -3576,7 +3609,7 @@
               <w:pStyle w:val="Compact"/>
             </w:pPr>
             <w:r>
-              <w:t xml:space="preserve">MM</w:t>
+              <w:t xml:space="preserve">MI</w:t>
             </w:r>
           </w:p>
         </w:tc>
@@ -3741,7 +3774,7 @@
               <w:pStyle w:val="Compact"/>
             </w:pPr>
             <w:r>
-              <w:t xml:space="preserve">MI</w:t>
+              <w:t xml:space="preserve">MM</w:t>
             </w:r>
           </w:p>
         </w:tc>
@@ -3919,7 +3952,7 @@
               <w:pStyle w:val="Compact"/>
             </w:pPr>
             <w:r>
-              <w:t xml:space="preserve">MI</w:t>
+              <w:t xml:space="preserve">MM</w:t>
             </w:r>
           </w:p>
         </w:tc>
@@ -3980,7 +4013,7 @@
               <w:pStyle w:val="Compact"/>
             </w:pPr>
             <w:r>
-              <w:t xml:space="preserve">MI</w:t>
+              <w:t xml:space="preserve">MM</w:t>
             </w:r>
           </w:p>
         </w:tc>
@@ -4096,7 +4129,7 @@
               <w:pStyle w:val="Compact"/>
             </w:pPr>
             <w:r>
-              <w:t xml:space="preserve">MI</w:t>
+              <w:t xml:space="preserve">MM</w:t>
             </w:r>
           </w:p>
         </w:tc>
@@ -4334,7 +4367,7 @@
               <w:pStyle w:val="Compact"/>
             </w:pPr>
             <w:r>
-              <w:t xml:space="preserve">MI</w:t>
+              <w:t xml:space="preserve">MM</w:t>
             </w:r>
           </w:p>
         </w:tc>
@@ -4459,7 +4492,7 @@
               <w:pStyle w:val="Compact"/>
             </w:pPr>
             <w:r>
-              <w:t xml:space="preserve">MI</w:t>
+              <w:t xml:space="preserve">MM</w:t>
             </w:r>
           </w:p>
         </w:tc>
@@ -4721,7 +4754,7 @@
               <w:pStyle w:val="Compact"/>
             </w:pPr>
             <w:r>
-              <w:t xml:space="preserve">MI</w:t>
+              <w:t xml:space="preserve">MM</w:t>
             </w:r>
           </w:p>
         </w:tc>
@@ -4782,7 +4815,7 @@
               <w:pStyle w:val="Compact"/>
             </w:pPr>
             <w:r>
-              <w:t xml:space="preserve">MI</w:t>
+              <w:t xml:space="preserve">MM</w:t>
             </w:r>
           </w:p>
         </w:tc>
@@ -4995,7 +5028,7 @@
               <w:pStyle w:val="Compact"/>
             </w:pPr>
             <w:r>
-              <w:t xml:space="preserve">MI</w:t>
+              <w:t xml:space="preserve">MM</w:t>
             </w:r>
           </w:p>
         </w:tc>
@@ -5178,7 +5211,7 @@
               <w:pStyle w:val="Compact"/>
             </w:pPr>
             <w:r>
-              <w:t xml:space="preserve">MI</w:t>
+              <w:t xml:space="preserve">MM</w:t>
             </w:r>
           </w:p>
         </w:tc>
@@ -5391,7 +5424,7 @@
               <w:pStyle w:val="Compact"/>
             </w:pPr>
             <w:r>
-              <w:t xml:space="preserve">MI</w:t>
+              <w:t xml:space="preserve">MM</w:t>
             </w:r>
           </w:p>
         </w:tc>
@@ -5498,7 +5531,7 @@
               <w:pStyle w:val="Compact"/>
             </w:pPr>
             <w:r>
-              <w:t xml:space="preserve">MM</w:t>
+              <w:t xml:space="preserve">MI</w:t>
             </w:r>
           </w:p>
         </w:tc>
@@ -5699,7 +5732,7 @@
               <w:pStyle w:val="Compact"/>
             </w:pPr>
             <w:r>
-              <w:t xml:space="preserve">MI</w:t>
+              <w:t xml:space="preserve">MM</w:t>
             </w:r>
           </w:p>
         </w:tc>
@@ -5813,53 +5846,53 @@
               <w:pStyle w:val="Compact"/>
             </w:pPr>
             <w:r>
+              <w:t xml:space="preserve">MM</w:t>
+            </w:r>
+          </w:p>
+        </w:tc>
+        <w:tc>
+          <w:tcPr/>
+          <w:p>
+            <w:pPr>
+              <w:pStyle w:val="Compact"/>
+            </w:pPr>
+            <w:r>
+              <w:t xml:space="preserve">21 Oct</w:t>
+            </w:r>
+          </w:p>
+        </w:tc>
+      </w:tr>
+      <w:tr>
+        <w:tc>
+          <w:tcPr/>
+          <w:p>
+            <w:pPr>
+              <w:pStyle w:val="Compact"/>
+            </w:pPr>
+            <w:r>
+              <w:t xml:space="preserve">34</w:t>
+            </w:r>
+          </w:p>
+        </w:tc>
+        <w:tc>
+          <w:tcPr/>
+          <w:p>
+            <w:pPr>
+              <w:pStyle w:val="Compact"/>
+            </w:pPr>
+            <w:r>
+              <w:t xml:space="preserve">Spread catalog prices per product type and grow catalog to ~620 products</w:t>
+            </w:r>
+          </w:p>
+        </w:tc>
+        <w:tc>
+          <w:tcPr/>
+          <w:p>
+            <w:pPr>
+              <w:pStyle w:val="Compact"/>
+            </w:pPr>
+            <w:r>
               <w:t xml:space="preserve">MI</w:t>
-            </w:r>
-          </w:p>
-        </w:tc>
-        <w:tc>
-          <w:tcPr/>
-          <w:p>
-            <w:pPr>
-              <w:pStyle w:val="Compact"/>
-            </w:pPr>
-            <w:r>
-              <w:t xml:space="preserve">21 Oct</w:t>
-            </w:r>
-          </w:p>
-        </w:tc>
-      </w:tr>
-      <w:tr>
-        <w:tc>
-          <w:tcPr/>
-          <w:p>
-            <w:pPr>
-              <w:pStyle w:val="Compact"/>
-            </w:pPr>
-            <w:r>
-              <w:t xml:space="preserve">34</w:t>
-            </w:r>
-          </w:p>
-        </w:tc>
-        <w:tc>
-          <w:tcPr/>
-          <w:p>
-            <w:pPr>
-              <w:pStyle w:val="Compact"/>
-            </w:pPr>
-            <w:r>
-              <w:t xml:space="preserve">Spread catalog prices per product type and grow catalog to ~620 products</w:t>
-            </w:r>
-          </w:p>
-        </w:tc>
-        <w:tc>
-          <w:tcPr/>
-          <w:p>
-            <w:pPr>
-              <w:pStyle w:val="Compact"/>
-            </w:pPr>
-            <w:r>
-              <w:t xml:space="preserve">MM</w:t>
             </w:r>
           </w:p>
         </w:tc>
@@ -6073,7 +6106,7 @@
               <w:pStyle w:val="Compact"/>
             </w:pPr>
             <w:r>
-              <w:t xml:space="preserve">MM</w:t>
+              <w:t xml:space="preserve">MI</w:t>
             </w:r>
           </w:p>
         </w:tc>

</xml_diff>